<commit_message>
Semester 1 Week 03: learning path, notebook explanations, slide and sheet fixes
- README: before you start, ordered path, outcomes, next week; PDF page numbers
- 9 notebooks: opening cell, explanation per code cell, constraint comments,
  "What do you notice?" cells (text and comments only; code unchanged)
- .pptx: diet constraints (14x5, 10x9), P* = 262.22, typos, labels, link
- tutorial/answers .docx: "at least / at most" wording; Q2a/Q2b headings

Co-Authored-By: Claude Opus 5.5 <noreply@anthropic.com>
Claude-Session: https://claude.ai/code/session_01RPdVCbcKC8bY5ft6RQbsbA

[skip ci]
</commit_message>
<xml_diff>
--- a/content/Lectures/Semester 1/Week 03 - Linear Programming 2/5 Source Files/Week 3 - Linear Programming 2 - Tutorial - Answers.docx
+++ b/content/Lectures/Semester 1/Week 03 - Linear Programming 2/5 Source Files/Week 3 - Linear Programming 2 - Tutorial - Answers.docx
@@ -527,7 +527,7 @@
         <w:pStyle w:val="ListParagraph"/>
       </w:pPr>
       <w:r>
-        <w:t>The selection chosen must weigh more than 320g and satisfy certain basic restrictions on fat and calorific content. These are outlined below:</w:t>
+        <w:t>The selection chosen must weigh at least 320g and satisfy certain basic restrictions on fat and calorific content. These are outlined below:</w:t>
       </w:r>
     </w:p>
     <w:p>
@@ -544,7 +544,7 @@
         </w:numPr>
       </w:pPr>
       <w:r>
-        <w:t>Total fat content by weight must be less than 45% of the total weight of the selection.</w:t>
+        <w:t>Total fat content by weight must be at most 45% of the total weight of the selection.</w:t>
       </w:r>
     </w:p>
     <w:p>
@@ -556,7 +556,7 @@
         </w:numPr>
       </w:pPr>
       <w:r>
-        <w:t>Calorific value of the selection must be less than 2850 calories.</w:t>
+        <w:t>Calorific value of the selection must be at most 2850 calories.</w:t>
       </w:r>
     </w:p>
     <w:p>
@@ -600,7 +600,7 @@
           <w:b/>
           <w:bCs/>
         </w:rPr>
-        <w:t xml:space="preserve">Formulate a model (using summation notation) given that the aim is to minimise the cost of the selection. Is this a good selection?</w:t>
+        <w:t xml:space="preserve">Formulate a model (using summation notation) given that the aim is to minimise the cost of the selection.</w:t>
       </w:r>
       <w:r>
         <w:rPr>
@@ -1256,7 +1256,7 @@
           <w:bCs/>
         </w:rPr>
         <w:lastRenderedPageBreak/>
-        <w:t xml:space="preserve">Obtain the optimal selection via Pyomo</w:t>
+        <w:t xml:space="preserve">Obtain the optimal selection via Pyomo **</w:t>
       </w:r>
     </w:p>
     <w:p>

</xml_diff>